<commit_message>
fix(p1): rebuild grammatical penalty instructions in both copies
</commit_message>
<xml_diff>
--- a/products-storage/01-zakrytie-rabot/13-uvedomlenie-o-prosrochke-oplaty.docx
+++ b/products-storage/01-zakrytie-rabot/13-uvedomlenie-o-prosrochke-oplaty.docx
@@ -1209,7 +1209,49 @@
           <w:sz w:val="24"/>
           <w:szCs w:val="24"/>
         </w:rPr>
-        <w:t xml:space="preserve">Выберите одно требование по условиям договора: проценты по ст. 395 ГК РФ либо договорную неустойку. В абзаце о начислении и в предупреждении об обращении в суд оставьте одну и ту же ветку; удалите текст другой ветки и пояснения в скобках. При выборе процентов замените слова «процентов (неустойки)» на «процентов»; при выборе неустойки — на «неустойки». При выборе неустойки проверьте дату начала и порядок её начисления по договору: они могут отличаться от расчёта процентов по ст. 395 ГК РФ. Одновременное взыскание по умолчанию не предполагается: правило п. 4 ст. 395 ГК РФ и условия договора нужно проверить до отправки.</w:t>
+        <w:t xml:space="preserve">Выберите одно требование по условиям договора: проценты по ст. 395 ГК РФ либо договорную неустойку. В абзаце о начислении и в предупреждении об обращении в суд оставьте одну и ту же ветку; удалите текст другой ветки и пояснения в скобках. При выборе процентов замените слова «процентов (неустойки)» на «процентов». При выборе неустойки абзац, начинающийся словами «Обращаем внимание, что с», замените целиком: «Обращаем внимание, что с </w:t>
+      </w:r>
+      <w:r>
+        <w:rPr>
+          <w:rFonts w:ascii="Times New Roman" w:cs="Times New Roman" w:eastAsia="Times New Roman" w:hAnsi="Times New Roman"/>
+          <w:b/>
+          <w:bCs/>
+          <w:i w:val="false"/>
+          <w:iCs w:val="false"/>
+          <w:color w:val="000000"/>
+          <w:sz w:val="24"/>
+          <w:szCs w:val="24"/>
+        </w:rPr>
+        <w:t xml:space="preserve">{{ДАТА_НАЧАЛА_ПРОСРОЧКИ}}</w:t>
+      </w:r>
+      <w:r>
+        <w:rPr>
+          <w:rFonts w:ascii="Times New Roman" w:cs="Times New Roman" w:eastAsia="Times New Roman" w:hAnsi="Times New Roman"/>
+          <w:sz w:val="24"/>
+          <w:szCs w:val="24"/>
+        </w:rPr>
+        <w:t xml:space="preserve"> на сумму задолженности начисляется неустойка по п. </w:t>
+      </w:r>
+      <w:r>
+        <w:rPr>
+          <w:rFonts w:ascii="Times New Roman" w:cs="Times New Roman" w:eastAsia="Times New Roman" w:hAnsi="Times New Roman"/>
+          <w:b/>
+          <w:bCs/>
+          <w:i w:val="false"/>
+          <w:iCs w:val="false"/>
+          <w:color w:val="000000"/>
+          <w:sz w:val="24"/>
+          <w:szCs w:val="24"/>
+        </w:rPr>
+        <w:t xml:space="preserve">{{ПУНКТ_ДОГОВОРА_О_НЕУСТОЙКЕ}}</w:t>
+      </w:r>
+      <w:r>
+        <w:rPr>
+          <w:rFonts w:ascii="Times New Roman" w:cs="Times New Roman" w:eastAsia="Times New Roman" w:hAnsi="Times New Roman"/>
+          <w:sz w:val="24"/>
+          <w:szCs w:val="24"/>
+        </w:rPr>
+        <w:t xml:space="preserve"> договора. Мы рассчитываем урегулировать вопрос в рабочем порядке. Настоящее письмо не является отказом от начисленной неустойки и её начисление не прекращает.» При выборе неустойки проверьте дату начала и порядок её начисления по договору: они могут отличаться от расчёта процентов по ст. 395 ГК РФ. Одновременное взыскание по умолчанию не предполагается: правило п. 4 ст. 395 ГК РФ и условия договора нужно проверить до отправки.</w:t>
       </w:r>
     </w:p>
     <w:p>

</xml_diff>